<commit_message>
added base project structute
</commit_message>
<xml_diff>
--- a/docs/КП_ОРПО.docx
+++ b/docs/КП_ОРПО.docx
@@ -2117,9 +2117,9 @@
       </w:tblPr>
       <w:tblGrid>
         <w:gridCol w:w="3257"/>
-        <w:gridCol w:w="2584"/>
+        <w:gridCol w:w="2583"/>
         <w:gridCol w:w="2338"/>
-        <w:gridCol w:w="1165"/>
+        <w:gridCol w:w="1166"/>
       </w:tblGrid>
       <w:tr>
         <w:trPr/>
@@ -2162,7 +2162,7 @@
         </w:tc>
         <w:tc>
           <w:tcPr>
-            <w:tcW w:w="2584" w:type="dxa"/>
+            <w:tcW w:w="2583" w:type="dxa"/>
             <w:tcBorders/>
           </w:tcPr>
           <w:p>
@@ -2236,7 +2236,7 @@
         </w:tc>
         <w:tc>
           <w:tcPr>
-            <w:tcW w:w="1165" w:type="dxa"/>
+            <w:tcW w:w="1166" w:type="dxa"/>
             <w:tcBorders/>
           </w:tcPr>
           <w:p>
@@ -2309,7 +2309,7 @@
         </w:tc>
         <w:tc>
           <w:tcPr>
-            <w:tcW w:w="2584" w:type="dxa"/>
+            <w:tcW w:w="2583" w:type="dxa"/>
             <w:tcBorders/>
           </w:tcPr>
           <w:p>
@@ -2375,7 +2375,7 @@
         </w:tc>
         <w:tc>
           <w:tcPr>
-            <w:tcW w:w="1165" w:type="dxa"/>
+            <w:tcW w:w="1166" w:type="dxa"/>
             <w:tcBorders/>
           </w:tcPr>
           <w:p>
@@ -2444,7 +2444,7 @@
         </w:tc>
         <w:tc>
           <w:tcPr>
-            <w:tcW w:w="2584" w:type="dxa"/>
+            <w:tcW w:w="2583" w:type="dxa"/>
             <w:tcBorders/>
           </w:tcPr>
           <w:p>
@@ -2510,7 +2510,7 @@
         </w:tc>
         <w:tc>
           <w:tcPr>
-            <w:tcW w:w="1165" w:type="dxa"/>
+            <w:tcW w:w="1166" w:type="dxa"/>
             <w:tcBorders/>
           </w:tcPr>
           <w:p>
@@ -2579,7 +2579,7 @@
         </w:tc>
         <w:tc>
           <w:tcPr>
-            <w:tcW w:w="2584" w:type="dxa"/>
+            <w:tcW w:w="2583" w:type="dxa"/>
             <w:tcBorders/>
           </w:tcPr>
           <w:p>
@@ -2645,7 +2645,7 @@
         </w:tc>
         <w:tc>
           <w:tcPr>
-            <w:tcW w:w="1165" w:type="dxa"/>
+            <w:tcW w:w="1166" w:type="dxa"/>
             <w:tcBorders/>
           </w:tcPr>
           <w:p>
@@ -3206,7 +3206,509 @@
           <w:szCs w:val="28"/>
           <w:lang w:val="ru-RU"/>
         </w:rPr>
-        <w:t>Функциональная модель TO-BE может быть представлена в нотации IDEF0 или BPMN. В приложении А приведена диаграмма вариантов использования (Use-Case), которая отражает основные сценарии работы неавторизованного и авторизованного пользователя. Диаграмма включает такие прецеденты, как «Просматривать интуитивный интерфейс редактора», «Использовать базовый набор инструментов», «Авторизоваться / Зарегистрироваться», «Сохранять карты в облако», «Создавать папки и теги», «Дублировать карты», «Загружать свои текстуры и спрайты», «Работать со слоями», «Настраивать сетку», «Добавлять текстовые метки и описания», «Экспортировать карту в высоком разрешении без водяных знаков», «Генерировать ссылку для просмотра карты», «Отменять и повторять действия (Undo/Redo)», «Генерировать случайную карту», «Комментировать карты в галерее».</w:t>
+        <w:t>Функциональная модел</w:t>
+      </w:r>
+      <w:r>
+        <w:rPr>
+          <w:rFonts w:eastAsia="Times New Roman" w:cs="Times New Roman" w:ascii="Times New Roman" w:hAnsi="Times New Roman"/>
+          <w:sz w:val="28"/>
+          <w:szCs w:val="28"/>
+          <w:lang w:val="ru-RU"/>
+        </w:rPr>
+        <w:t>и</w:t>
+      </w:r>
+      <w:r>
+        <w:rPr>
+          <w:rFonts w:eastAsia="Times New Roman" w:cs="Times New Roman" w:ascii="Times New Roman" w:hAnsi="Times New Roman"/>
+          <w:sz w:val="28"/>
+          <w:szCs w:val="28"/>
+          <w:lang w:val="ru-RU"/>
+        </w:rPr>
+        <w:t xml:space="preserve"> представлен</w:t>
+      </w:r>
+      <w:r>
+        <w:rPr>
+          <w:rFonts w:eastAsia="Times New Roman" w:cs="Times New Roman" w:ascii="Times New Roman" w:hAnsi="Times New Roman"/>
+          <w:sz w:val="28"/>
+          <w:szCs w:val="28"/>
+          <w:lang w:val="ru-RU"/>
+        </w:rPr>
+        <w:t>ы</w:t>
+      </w:r>
+      <w:r>
+        <w:rPr>
+          <w:rFonts w:eastAsia="Times New Roman" w:cs="Times New Roman" w:ascii="Times New Roman" w:hAnsi="Times New Roman"/>
+          <w:sz w:val="28"/>
+          <w:szCs w:val="28"/>
+          <w:lang w:val="ru-RU"/>
+        </w:rPr>
+        <w:t xml:space="preserve"> в нотации IDEF0. В приложении А приведена диаграмма вариантов использования (Use-Case), которая отражает основные сценарии работы неавторизованного и авторизованного пользователя. Диаграмма включает такие прецеденты, как «Просматривать интуитивный интерфейс редактора», «Использовать базовый набор инструментов», «Авторизоваться / Зарегистрироваться», «Сохранять карты в облако», «Создавать папки и теги», «Дублировать карты», «Загружать свои текстуры и спрайты», «Работать со слоями», «Настраивать сетку», «Добавлять текстовые метки и описания», «Экспортировать карту в высоком разрешении без водяных знаков», «Генерировать ссылку для просмотра карты», «Отменять и повторять действия (Undo/Redo)», «Генерировать случайную карту», «Комментировать карты в галерее».</w:t>
+      </w:r>
+    </w:p>
+    <w:p>
+      <w:pPr>
+        <w:pStyle w:val="Normal"/>
+        <w:spacing w:lineRule="auto" w:line="360" w:before="0" w:after="0"/>
+        <w:ind w:firstLine="709"/>
+        <w:jc w:val="both"/>
+        <w:rPr>
+          <w:rFonts w:ascii="Times New Roman" w:hAnsi="Times New Roman" w:eastAsia="Times New Roman" w:cs="Times New Roman"/>
+          <w:sz w:val="28"/>
+          <w:szCs w:val="28"/>
+          <w:lang w:val="ru-RU"/>
+        </w:rPr>
+      </w:pPr>
+      <w:r>
+        <w:rPr>
+          <w:rFonts w:eastAsia="Times New Roman" w:cs="Times New Roman" w:ascii="Times New Roman" w:hAnsi="Times New Roman"/>
+          <w:sz w:val="28"/>
+          <w:szCs w:val="28"/>
+          <w:lang w:val="ru-RU"/>
+        </w:rPr>
+        <w:t>Диаграммы последовательности AS-IS и TO-BE приведены соответственно на рисунках 1.1-1.2 и 1.3-1.4.</w:t>
+      </w:r>
+    </w:p>
+    <w:p>
+      <w:pPr>
+        <w:pStyle w:val="Normal"/>
+        <w:spacing w:lineRule="auto" w:line="360" w:before="0" w:after="0"/>
+        <w:ind w:firstLine="709"/>
+        <w:jc w:val="center"/>
+        <w:rPr>
+          <w:rFonts w:ascii="Times New Roman" w:hAnsi="Times New Roman" w:eastAsia="Times New Roman" w:cs="Times New Roman"/>
+          <w:sz w:val="28"/>
+          <w:szCs w:val="28"/>
+          <w:lang w:val="ru-RU"/>
+        </w:rPr>
+      </w:pPr>
+      <w:r>
+        <w:rPr>
+          <w:rFonts w:eastAsia="Times New Roman" w:cs="Times New Roman" w:ascii="Times New Roman" w:hAnsi="Times New Roman"/>
+          <w:sz w:val="28"/>
+          <w:szCs w:val="28"/>
+          <w:lang w:val="ru-RU"/>
+        </w:rPr>
+        <w:drawing>
+          <wp:inline distT="0" distB="0" distL="0" distR="0">
+            <wp:extent cx="4481195" cy="3705860"/>
+            <wp:effectExtent l="0" t="0" r="0" b="0"/>
+            <wp:docPr id="1" name="Image1"/>
+            <wp:cNvGraphicFramePr>
+              <a:graphicFrameLocks xmlns:a="http://schemas.openxmlformats.org/drawingml/2006/main" noChangeAspect="1"/>
+            </wp:cNvGraphicFramePr>
+            <a:graphic xmlns:a="http://schemas.openxmlformats.org/drawingml/2006/main">
+              <a:graphicData uri="http://schemas.openxmlformats.org/drawingml/2006/picture">
+                <pic:pic xmlns:pic="http://schemas.openxmlformats.org/drawingml/2006/picture">
+                  <pic:nvPicPr>
+                    <pic:cNvPr id="1" name="Image1"/>
+                    <pic:cNvPicPr>
+                      <a:picLocks noChangeAspect="1" noChangeArrowheads="1"/>
+                    </pic:cNvPicPr>
+                  </pic:nvPicPr>
+                  <pic:blipFill>
+                    <a:blip r:embed="rId2"/>
+                    <a:stretch>
+                      <a:fillRect/>
+                    </a:stretch>
+                  </pic:blipFill>
+                  <pic:spPr bwMode="auto">
+                    <a:xfrm>
+                      <a:off x="0" y="0"/>
+                      <a:ext cx="4481195" cy="3705860"/>
+                    </a:xfrm>
+                    <a:prstGeom prst="rect">
+                      <a:avLst/>
+                    </a:prstGeom>
+                    <a:noFill/>
+                  </pic:spPr>
+                </pic:pic>
+              </a:graphicData>
+            </a:graphic>
+          </wp:inline>
+        </w:drawing>
+      </w:r>
+    </w:p>
+    <w:p>
+      <w:pPr>
+        <w:pStyle w:val="Normal"/>
+        <w:spacing w:lineRule="auto" w:line="360" w:before="0" w:after="0"/>
+        <w:ind w:firstLine="709"/>
+        <w:jc w:val="center"/>
+        <w:rPr>
+          <w:rFonts w:ascii="Times New Roman" w:hAnsi="Times New Roman" w:eastAsia="Times New Roman" w:cs="Times New Roman"/>
+          <w:sz w:val="28"/>
+          <w:szCs w:val="28"/>
+          <w:lang w:val="ru-RU"/>
+        </w:rPr>
+      </w:pPr>
+      <w:r>
+        <w:rPr>
+          <w:rFonts w:eastAsia="Times New Roman" w:cs="Times New Roman" w:ascii="Times New Roman" w:hAnsi="Times New Roman"/>
+          <w:sz w:val="28"/>
+          <w:szCs w:val="28"/>
+          <w:lang w:val="ru-RU"/>
+        </w:rPr>
+        <w:t>Рисунок 1.1 — Диаграмма AS-IS уровня A-0</w:t>
+      </w:r>
+    </w:p>
+    <w:p>
+      <w:pPr>
+        <w:pStyle w:val="Normal"/>
+        <w:spacing w:lineRule="auto" w:line="360" w:before="0" w:after="0"/>
+        <w:ind w:firstLine="709"/>
+        <w:jc w:val="center"/>
+        <w:rPr>
+          <w:rFonts w:ascii="Times New Roman" w:hAnsi="Times New Roman" w:eastAsia="Times New Roman" w:cs="Times New Roman"/>
+          <w:sz w:val="28"/>
+          <w:szCs w:val="28"/>
+          <w:lang w:val="ru-RU"/>
+        </w:rPr>
+      </w:pPr>
+      <w:r>
+        <w:rPr>
+          <w:rFonts w:eastAsia="Times New Roman" w:cs="Times New Roman" w:ascii="Times New Roman" w:hAnsi="Times New Roman"/>
+          <w:sz w:val="28"/>
+          <w:szCs w:val="28"/>
+          <w:lang w:val="ru-RU"/>
+        </w:rPr>
+      </w:r>
+    </w:p>
+    <w:p>
+      <w:pPr>
+        <w:pStyle w:val="Normal"/>
+        <w:spacing w:lineRule="auto" w:line="360" w:before="0" w:after="0"/>
+        <w:ind w:firstLine="709"/>
+        <w:jc w:val="center"/>
+        <w:rPr>
+          <w:rFonts w:ascii="Times New Roman" w:hAnsi="Times New Roman" w:eastAsia="Times New Roman" w:cs="Times New Roman"/>
+          <w:sz w:val="28"/>
+          <w:szCs w:val="28"/>
+          <w:lang w:val="ru-RU"/>
+        </w:rPr>
+      </w:pPr>
+      <w:r>
+        <w:rPr>
+          <w:rFonts w:eastAsia="Times New Roman" w:cs="Times New Roman" w:ascii="Times New Roman" w:hAnsi="Times New Roman"/>
+          <w:sz w:val="28"/>
+          <w:szCs w:val="28"/>
+          <w:lang w:val="ru-RU"/>
+        </w:rPr>
+        <w:drawing>
+          <wp:inline distT="0" distB="0" distL="0" distR="0">
+            <wp:extent cx="5939790" cy="3171825"/>
+            <wp:effectExtent l="0" t="0" r="0" b="0"/>
+            <wp:docPr id="2" name="Image2"/>
+            <wp:cNvGraphicFramePr>
+              <a:graphicFrameLocks xmlns:a="http://schemas.openxmlformats.org/drawingml/2006/main" noChangeAspect="1"/>
+            </wp:cNvGraphicFramePr>
+            <a:graphic xmlns:a="http://schemas.openxmlformats.org/drawingml/2006/main">
+              <a:graphicData uri="http://schemas.openxmlformats.org/drawingml/2006/picture">
+                <pic:pic xmlns:pic="http://schemas.openxmlformats.org/drawingml/2006/picture">
+                  <pic:nvPicPr>
+                    <pic:cNvPr id="2" name="Image2"/>
+                    <pic:cNvPicPr>
+                      <a:picLocks noChangeAspect="1" noChangeArrowheads="1"/>
+                    </pic:cNvPicPr>
+                  </pic:nvPicPr>
+                  <pic:blipFill>
+                    <a:blip r:embed="rId3"/>
+                    <a:stretch>
+                      <a:fillRect/>
+                    </a:stretch>
+                  </pic:blipFill>
+                  <pic:spPr bwMode="auto">
+                    <a:xfrm>
+                      <a:off x="0" y="0"/>
+                      <a:ext cx="5939790" cy="3171825"/>
+                    </a:xfrm>
+                    <a:prstGeom prst="rect">
+                      <a:avLst/>
+                    </a:prstGeom>
+                    <a:noFill/>
+                  </pic:spPr>
+                </pic:pic>
+              </a:graphicData>
+            </a:graphic>
+          </wp:inline>
+        </w:drawing>
+      </w:r>
+    </w:p>
+    <w:p>
+      <w:pPr>
+        <w:pStyle w:val="Normal"/>
+        <w:spacing w:lineRule="auto" w:line="360" w:before="0" w:after="0"/>
+        <w:ind w:firstLine="709"/>
+        <w:jc w:val="center"/>
+        <w:rPr>
+          <w:rFonts w:ascii="Times New Roman" w:hAnsi="Times New Roman" w:eastAsia="Times New Roman" w:cs="Times New Roman"/>
+          <w:sz w:val="28"/>
+          <w:szCs w:val="28"/>
+          <w:lang w:val="ru-RU"/>
+        </w:rPr>
+      </w:pPr>
+      <w:r>
+        <w:rPr>
+          <w:rFonts w:eastAsia="Times New Roman" w:cs="Times New Roman" w:ascii="Times New Roman" w:hAnsi="Times New Roman"/>
+          <w:sz w:val="28"/>
+          <w:szCs w:val="28"/>
+          <w:lang w:val="ru-RU"/>
+        </w:rPr>
+        <w:t>Рисунок 1.2 — Диаграмма AS-IS уровня А0</w:t>
+      </w:r>
+    </w:p>
+    <w:p>
+      <w:pPr>
+        <w:pStyle w:val="Normal"/>
+        <w:spacing w:lineRule="auto" w:line="360" w:before="0" w:after="0"/>
+        <w:ind w:firstLine="709"/>
+        <w:jc w:val="center"/>
+        <w:rPr>
+          <w:rFonts w:ascii="Times New Roman" w:hAnsi="Times New Roman" w:eastAsia="Times New Roman" w:cs="Times New Roman"/>
+          <w:sz w:val="28"/>
+          <w:szCs w:val="28"/>
+          <w:lang w:val="ru-RU"/>
+        </w:rPr>
+      </w:pPr>
+      <w:r>
+        <w:rPr>
+          <w:rFonts w:eastAsia="Times New Roman" w:cs="Times New Roman" w:ascii="Times New Roman" w:hAnsi="Times New Roman"/>
+          <w:sz w:val="28"/>
+          <w:szCs w:val="28"/>
+          <w:lang w:val="ru-RU"/>
+        </w:rPr>
+      </w:r>
+    </w:p>
+    <w:p>
+      <w:pPr>
+        <w:pStyle w:val="Normal"/>
+        <w:spacing w:lineRule="auto" w:line="360" w:before="0" w:after="0"/>
+        <w:ind w:firstLine="709"/>
+        <w:jc w:val="center"/>
+        <w:rPr>
+          <w:rFonts w:ascii="Times New Roman" w:hAnsi="Times New Roman" w:eastAsia="Times New Roman" w:cs="Times New Roman"/>
+          <w:sz w:val="28"/>
+          <w:szCs w:val="28"/>
+          <w:lang w:val="ru-RU"/>
+        </w:rPr>
+      </w:pPr>
+      <w:r>
+        <w:rPr>
+          <w:rFonts w:eastAsia="Times New Roman" w:cs="Times New Roman" w:ascii="Times New Roman" w:hAnsi="Times New Roman"/>
+          <w:sz w:val="28"/>
+          <w:szCs w:val="28"/>
+          <w:lang w:val="ru-RU"/>
+        </w:rPr>
+        <w:drawing>
+          <wp:inline distT="0" distB="0" distL="0" distR="0">
+            <wp:extent cx="5010150" cy="4124325"/>
+            <wp:effectExtent l="0" t="0" r="0" b="0"/>
+            <wp:docPr id="3" name="Image3"/>
+            <wp:cNvGraphicFramePr>
+              <a:graphicFrameLocks xmlns:a="http://schemas.openxmlformats.org/drawingml/2006/main" noChangeAspect="1"/>
+            </wp:cNvGraphicFramePr>
+            <a:graphic xmlns:a="http://schemas.openxmlformats.org/drawingml/2006/main">
+              <a:graphicData uri="http://schemas.openxmlformats.org/drawingml/2006/picture">
+                <pic:pic xmlns:pic="http://schemas.openxmlformats.org/drawingml/2006/picture">
+                  <pic:nvPicPr>
+                    <pic:cNvPr id="3" name="Image3"/>
+                    <pic:cNvPicPr>
+                      <a:picLocks noChangeAspect="1" noChangeArrowheads="1"/>
+                    </pic:cNvPicPr>
+                  </pic:nvPicPr>
+                  <pic:blipFill>
+                    <a:blip r:embed="rId4"/>
+                    <a:stretch>
+                      <a:fillRect/>
+                    </a:stretch>
+                  </pic:blipFill>
+                  <pic:spPr bwMode="auto">
+                    <a:xfrm>
+                      <a:off x="0" y="0"/>
+                      <a:ext cx="5010150" cy="4124325"/>
+                    </a:xfrm>
+                    <a:prstGeom prst="rect">
+                      <a:avLst/>
+                    </a:prstGeom>
+                    <a:noFill/>
+                  </pic:spPr>
+                </pic:pic>
+              </a:graphicData>
+            </a:graphic>
+          </wp:inline>
+        </w:drawing>
+      </w:r>
+    </w:p>
+    <w:p>
+      <w:pPr>
+        <w:pStyle w:val="Normal"/>
+        <w:spacing w:lineRule="auto" w:line="360" w:before="0" w:after="0"/>
+        <w:ind w:firstLine="709"/>
+        <w:jc w:val="center"/>
+        <w:rPr>
+          <w:rFonts w:ascii="Times New Roman" w:hAnsi="Times New Roman" w:eastAsia="Times New Roman" w:cs="Times New Roman"/>
+          <w:sz w:val="28"/>
+          <w:szCs w:val="28"/>
+          <w:lang w:val="ru-RU"/>
+        </w:rPr>
+      </w:pPr>
+      <w:r>
+        <w:rPr>
+          <w:rFonts w:eastAsia="Times New Roman" w:cs="Times New Roman" w:ascii="Times New Roman" w:hAnsi="Times New Roman"/>
+          <w:sz w:val="28"/>
+          <w:szCs w:val="28"/>
+          <w:lang w:val="ru-RU"/>
+        </w:rPr>
+        <w:t>Рисунок 1.3 — Диаграмма TO-BE уровня A-0</w:t>
+      </w:r>
+    </w:p>
+    <w:p>
+      <w:pPr>
+        <w:pStyle w:val="Normal"/>
+        <w:spacing w:lineRule="auto" w:line="360" w:before="0" w:after="0"/>
+        <w:ind w:firstLine="709"/>
+        <w:jc w:val="center"/>
+        <w:rPr>
+          <w:rFonts w:ascii="Times New Roman" w:hAnsi="Times New Roman" w:eastAsia="Times New Roman" w:cs="Times New Roman"/>
+          <w:sz w:val="28"/>
+          <w:szCs w:val="28"/>
+          <w:lang w:val="ru-RU"/>
+        </w:rPr>
+      </w:pPr>
+      <w:r>
+        <w:rPr>
+          <w:rFonts w:eastAsia="Times New Roman" w:cs="Times New Roman" w:ascii="Times New Roman" w:hAnsi="Times New Roman"/>
+          <w:sz w:val="28"/>
+          <w:szCs w:val="28"/>
+          <w:lang w:val="ru-RU"/>
+        </w:rPr>
+      </w:r>
+    </w:p>
+    <w:p>
+      <w:pPr>
+        <w:pStyle w:val="Normal"/>
+        <w:spacing w:lineRule="auto" w:line="360" w:before="0" w:after="0"/>
+        <w:ind w:firstLine="709"/>
+        <w:jc w:val="center"/>
+        <w:rPr>
+          <w:rFonts w:ascii="Times New Roman" w:hAnsi="Times New Roman" w:eastAsia="Times New Roman" w:cs="Times New Roman"/>
+          <w:sz w:val="28"/>
+          <w:szCs w:val="28"/>
+          <w:lang w:val="ru-RU"/>
+        </w:rPr>
+      </w:pPr>
+      <w:r>
+        <w:rPr>
+          <w:rFonts w:eastAsia="Times New Roman" w:cs="Times New Roman" w:ascii="Times New Roman" w:hAnsi="Times New Roman"/>
+          <w:sz w:val="28"/>
+          <w:szCs w:val="28"/>
+          <w:lang w:val="ru-RU"/>
+        </w:rPr>
+        <w:drawing>
+          <wp:inline distT="0" distB="0" distL="0" distR="0">
+            <wp:extent cx="5939790" cy="3156585"/>
+            <wp:effectExtent l="0" t="0" r="0" b="0"/>
+            <wp:docPr id="4" name="Image4"/>
+            <wp:cNvGraphicFramePr>
+              <a:graphicFrameLocks xmlns:a="http://schemas.openxmlformats.org/drawingml/2006/main" noChangeAspect="1"/>
+            </wp:cNvGraphicFramePr>
+            <a:graphic xmlns:a="http://schemas.openxmlformats.org/drawingml/2006/main">
+              <a:graphicData uri="http://schemas.openxmlformats.org/drawingml/2006/picture">
+                <pic:pic xmlns:pic="http://schemas.openxmlformats.org/drawingml/2006/picture">
+                  <pic:nvPicPr>
+                    <pic:cNvPr id="4" name="Image4"/>
+                    <pic:cNvPicPr>
+                      <a:picLocks noChangeAspect="1" noChangeArrowheads="1"/>
+                    </pic:cNvPicPr>
+                  </pic:nvPicPr>
+                  <pic:blipFill>
+                    <a:blip r:embed="rId5"/>
+                    <a:stretch>
+                      <a:fillRect/>
+                    </a:stretch>
+                  </pic:blipFill>
+                  <pic:spPr bwMode="auto">
+                    <a:xfrm>
+                      <a:off x="0" y="0"/>
+                      <a:ext cx="5939790" cy="3156585"/>
+                    </a:xfrm>
+                    <a:prstGeom prst="rect">
+                      <a:avLst/>
+                    </a:prstGeom>
+                    <a:noFill/>
+                  </pic:spPr>
+                </pic:pic>
+              </a:graphicData>
+            </a:graphic>
+          </wp:inline>
+        </w:drawing>
+      </w:r>
+    </w:p>
+    <w:p>
+      <w:pPr>
+        <w:pStyle w:val="Normal"/>
+        <w:spacing w:lineRule="auto" w:line="360" w:before="0" w:after="0"/>
+        <w:ind w:firstLine="709"/>
+        <w:jc w:val="center"/>
+        <w:rPr>
+          <w:rFonts w:ascii="Times New Roman" w:hAnsi="Times New Roman" w:eastAsia="Times New Roman" w:cs="Times New Roman"/>
+          <w:sz w:val="28"/>
+          <w:szCs w:val="28"/>
+          <w:lang w:val="ru-RU"/>
+        </w:rPr>
+      </w:pPr>
+      <w:r>
+        <w:rPr>
+          <w:rFonts w:eastAsia="Times New Roman" w:cs="Times New Roman" w:ascii="Times New Roman" w:hAnsi="Times New Roman"/>
+          <w:sz w:val="28"/>
+          <w:szCs w:val="28"/>
+          <w:lang w:val="ru-RU"/>
+        </w:rPr>
+        <w:t>Рисунок 1.4 — Диаграмма TO-BE уровня A0</w:t>
+      </w:r>
+    </w:p>
+    <w:p>
+      <w:pPr>
+        <w:pStyle w:val="Normal"/>
+        <w:spacing w:lineRule="auto" w:line="360" w:before="0" w:after="0"/>
+        <w:ind w:firstLine="709"/>
+        <w:jc w:val="center"/>
+        <w:rPr>
+          <w:rFonts w:ascii="Times New Roman" w:hAnsi="Times New Roman" w:eastAsia="Times New Roman" w:cs="Times New Roman"/>
+          <w:sz w:val="28"/>
+          <w:szCs w:val="28"/>
+          <w:lang w:val="ru-RU"/>
+        </w:rPr>
+      </w:pPr>
+      <w:r>
+        <w:rPr>
+          <w:rFonts w:eastAsia="Times New Roman" w:cs="Times New Roman" w:ascii="Times New Roman" w:hAnsi="Times New Roman"/>
+          <w:sz w:val="28"/>
+          <w:szCs w:val="28"/>
+          <w:lang w:val="ru-RU"/>
+        </w:rPr>
+      </w:r>
+    </w:p>
+    <w:p>
+      <w:pPr>
+        <w:pStyle w:val="Normal"/>
+        <w:spacing w:lineRule="auto" w:line="360" w:before="0" w:after="0"/>
+        <w:ind w:firstLine="709"/>
+        <w:jc w:val="both"/>
+        <w:rPr>
+          <w:rFonts w:ascii="Times New Roman" w:hAnsi="Times New Roman" w:eastAsia="Times New Roman" w:cs="Times New Roman"/>
+          <w:sz w:val="28"/>
+          <w:szCs w:val="28"/>
+          <w:lang w:val="ru-RU"/>
+        </w:rPr>
+      </w:pPr>
+      <w:r>
+        <w:rPr>
+          <w:rFonts w:eastAsia="Times New Roman" w:cs="Times New Roman" w:ascii="Times New Roman" w:hAnsi="Times New Roman"/>
+          <w:sz w:val="28"/>
+          <w:szCs w:val="28"/>
+          <w:lang w:val="ru-RU"/>
+        </w:rPr>
+        <w:t>Согласно диаграммам последовательностей, при использовании веб-приложения генератора карт удастся автоматизировать и в следствии избежать этапа проектирования структуры карты.</w:t>
       </w:r>
     </w:p>
     <w:p>
@@ -3269,8 +3771,8 @@
         <w:tblLook w:noHBand="0" w:noVBand="1" w:firstColumn="1" w:lastRow="0" w:lastColumn="0" w:firstRow="1" w:val="04a0"/>
       </w:tblPr>
       <w:tblGrid>
-        <w:gridCol w:w="853"/>
-        <w:gridCol w:w="1626"/>
+        <w:gridCol w:w="852"/>
+        <w:gridCol w:w="1627"/>
         <w:gridCol w:w="3112"/>
         <w:gridCol w:w="3981"/>
       </w:tblGrid>
@@ -3281,7 +3783,7 @@
         </w:trPr>
         <w:tc>
           <w:tcPr>
-            <w:tcW w:w="853" w:type="dxa"/>
+            <w:tcW w:w="852" w:type="dxa"/>
             <w:tcBorders>
               <w:top w:val="single" w:sz="4" w:space="0" w:color="000000"/>
               <w:start w:val="single" w:sz="4" w:space="0" w:color="000000"/>
@@ -3313,7 +3815,7 @@
         </w:tc>
         <w:tc>
           <w:tcPr>
-            <w:tcW w:w="1626" w:type="dxa"/>
+            <w:tcW w:w="1627" w:type="dxa"/>
             <w:tcBorders>
               <w:top w:val="single" w:sz="4" w:space="0" w:color="000000"/>
               <w:start w:val="single" w:sz="4" w:space="0" w:color="000000"/>
@@ -3424,7 +3926,7 @@
         <w:trPr/>
         <w:tc>
           <w:tcPr>
-            <w:tcW w:w="853" w:type="dxa"/>
+            <w:tcW w:w="852" w:type="dxa"/>
             <w:tcBorders>
               <w:top w:val="single" w:sz="4" w:space="0" w:color="000000"/>
               <w:start w:val="single" w:sz="4" w:space="0" w:color="000000"/>
@@ -3455,7 +3957,7 @@
         </w:tc>
         <w:tc>
           <w:tcPr>
-            <w:tcW w:w="1626" w:type="dxa"/>
+            <w:tcW w:w="1627" w:type="dxa"/>
             <w:tcBorders>
               <w:top w:val="single" w:sz="4" w:space="0" w:color="000000"/>
               <w:start w:val="single" w:sz="4" w:space="0" w:color="000000"/>
@@ -3610,7 +4112,7 @@
         <w:trPr/>
         <w:tc>
           <w:tcPr>
-            <w:tcW w:w="853" w:type="dxa"/>
+            <w:tcW w:w="852" w:type="dxa"/>
             <w:tcBorders>
               <w:top w:val="single" w:sz="4" w:space="0" w:color="000000"/>
               <w:start w:val="single" w:sz="4" w:space="0" w:color="000000"/>
@@ -3641,7 +4143,7 @@
         </w:tc>
         <w:tc>
           <w:tcPr>
-            <w:tcW w:w="1626" w:type="dxa"/>
+            <w:tcW w:w="1627" w:type="dxa"/>
             <w:tcBorders>
               <w:top w:val="single" w:sz="4" w:space="0" w:color="000000"/>
               <w:start w:val="single" w:sz="4" w:space="0" w:color="000000"/>
@@ -3881,8 +4383,8 @@
         <w:tblLook w:noHBand="0" w:noVBand="1" w:firstColumn="1" w:lastRow="0" w:lastColumn="0" w:firstRow="1" w:val="04a0"/>
       </w:tblPr>
       <w:tblGrid>
-        <w:gridCol w:w="853"/>
-        <w:gridCol w:w="1626"/>
+        <w:gridCol w:w="852"/>
+        <w:gridCol w:w="1627"/>
         <w:gridCol w:w="3112"/>
         <w:gridCol w:w="3981"/>
       </w:tblGrid>
@@ -3890,7 +4392,7 @@
         <w:trPr/>
         <w:tc>
           <w:tcPr>
-            <w:tcW w:w="853" w:type="dxa"/>
+            <w:tcW w:w="852" w:type="dxa"/>
             <w:tcBorders>
               <w:top w:val="single" w:sz="4" w:space="0" w:color="000000"/>
               <w:start w:val="single" w:sz="4" w:space="0" w:color="000000"/>
@@ -3921,7 +4423,7 @@
         </w:tc>
         <w:tc>
           <w:tcPr>
-            <w:tcW w:w="1626" w:type="dxa"/>
+            <w:tcW w:w="1627" w:type="dxa"/>
             <w:tcBorders>
               <w:top w:val="single" w:sz="4" w:space="0" w:color="000000"/>
               <w:start w:val="single" w:sz="4" w:space="0" w:color="000000"/>
@@ -4030,7 +4532,7 @@
         <w:trPr/>
         <w:tc>
           <w:tcPr>
-            <w:tcW w:w="853" w:type="dxa"/>
+            <w:tcW w:w="852" w:type="dxa"/>
             <w:tcBorders>
               <w:top w:val="single" w:sz="4" w:space="0" w:color="000000"/>
               <w:start w:val="single" w:sz="4" w:space="0" w:color="000000"/>
@@ -4061,7 +4563,7 @@
         </w:tc>
         <w:tc>
           <w:tcPr>
-            <w:tcW w:w="1626" w:type="dxa"/>
+            <w:tcW w:w="1627" w:type="dxa"/>
             <w:tcBorders>
               <w:top w:val="single" w:sz="4" w:space="0" w:color="000000"/>
               <w:start w:val="single" w:sz="4" w:space="0" w:color="000000"/>
@@ -4216,7 +4718,7 @@
         <w:trPr/>
         <w:tc>
           <w:tcPr>
-            <w:tcW w:w="853" w:type="dxa"/>
+            <w:tcW w:w="852" w:type="dxa"/>
             <w:tcBorders>
               <w:top w:val="single" w:sz="4" w:space="0" w:color="000000"/>
               <w:start w:val="single" w:sz="4" w:space="0" w:color="000000"/>
@@ -4247,7 +4749,7 @@
         </w:tc>
         <w:tc>
           <w:tcPr>
-            <w:tcW w:w="1626" w:type="dxa"/>
+            <w:tcW w:w="1627" w:type="dxa"/>
             <w:tcBorders>
               <w:top w:val="single" w:sz="4" w:space="0" w:color="000000"/>
               <w:start w:val="single" w:sz="4" w:space="0" w:color="000000"/>
@@ -4504,8 +5006,8 @@
         <w:tblLook w:noHBand="0" w:noVBand="1" w:firstColumn="1" w:lastRow="0" w:lastColumn="0" w:firstRow="1" w:val="04a0"/>
       </w:tblPr>
       <w:tblGrid>
-        <w:gridCol w:w="853"/>
-        <w:gridCol w:w="1626"/>
+        <w:gridCol w:w="852"/>
+        <w:gridCol w:w="1627"/>
         <w:gridCol w:w="3112"/>
         <w:gridCol w:w="3981"/>
       </w:tblGrid>
@@ -4513,7 +5015,7 @@
         <w:trPr/>
         <w:tc>
           <w:tcPr>
-            <w:tcW w:w="853" w:type="dxa"/>
+            <w:tcW w:w="852" w:type="dxa"/>
             <w:tcBorders>
               <w:top w:val="single" w:sz="4" w:space="0" w:color="000000"/>
               <w:start w:val="single" w:sz="4" w:space="0" w:color="000000"/>
@@ -4544,7 +5046,7 @@
         </w:tc>
         <w:tc>
           <w:tcPr>
-            <w:tcW w:w="1626" w:type="dxa"/>
+            <w:tcW w:w="1627" w:type="dxa"/>
             <w:tcBorders>
               <w:top w:val="single" w:sz="4" w:space="0" w:color="000000"/>
               <w:start w:val="single" w:sz="4" w:space="0" w:color="000000"/>
@@ -4653,7 +5155,7 @@
         <w:trPr/>
         <w:tc>
           <w:tcPr>
-            <w:tcW w:w="853" w:type="dxa"/>
+            <w:tcW w:w="852" w:type="dxa"/>
             <w:tcBorders>
               <w:top w:val="single" w:sz="4" w:space="0" w:color="000000"/>
               <w:start w:val="single" w:sz="4" w:space="0" w:color="000000"/>
@@ -4684,7 +5186,7 @@
         </w:tc>
         <w:tc>
           <w:tcPr>
-            <w:tcW w:w="1626" w:type="dxa"/>
+            <w:tcW w:w="1627" w:type="dxa"/>
             <w:tcBorders>
               <w:top w:val="single" w:sz="4" w:space="0" w:color="000000"/>
               <w:start w:val="single" w:sz="4" w:space="0" w:color="000000"/>
@@ -4862,7 +5364,7 @@
         <w:trPr/>
         <w:tc>
           <w:tcPr>
-            <w:tcW w:w="853" w:type="dxa"/>
+            <w:tcW w:w="852" w:type="dxa"/>
             <w:tcBorders>
               <w:top w:val="single" w:sz="4" w:space="0" w:color="000000"/>
               <w:start w:val="single" w:sz="4" w:space="0" w:color="000000"/>
@@ -4893,7 +5395,7 @@
         </w:tc>
         <w:tc>
           <w:tcPr>
-            <w:tcW w:w="1626" w:type="dxa"/>
+            <w:tcW w:w="1627" w:type="dxa"/>
             <w:tcBorders>
               <w:top w:val="single" w:sz="4" w:space="0" w:color="000000"/>
               <w:start w:val="single" w:sz="4" w:space="0" w:color="000000"/>
@@ -5071,7 +5573,7 @@
         <w:trPr/>
         <w:tc>
           <w:tcPr>
-            <w:tcW w:w="853" w:type="dxa"/>
+            <w:tcW w:w="852" w:type="dxa"/>
             <w:tcBorders>
               <w:top w:val="single" w:sz="4" w:space="0" w:color="000000"/>
               <w:start w:val="single" w:sz="4" w:space="0" w:color="000000"/>
@@ -5102,7 +5604,7 @@
         </w:tc>
         <w:tc>
           <w:tcPr>
-            <w:tcW w:w="1626" w:type="dxa"/>
+            <w:tcW w:w="1627" w:type="dxa"/>
             <w:tcBorders>
               <w:top w:val="single" w:sz="4" w:space="0" w:color="000000"/>
               <w:start w:val="single" w:sz="4" w:space="0" w:color="000000"/>
@@ -5329,8 +5831,8 @@
         <w:tblLook w:noHBand="0" w:noVBand="1" w:firstColumn="1" w:lastRow="0" w:lastColumn="0" w:firstRow="1" w:val="04a0"/>
       </w:tblPr>
       <w:tblGrid>
-        <w:gridCol w:w="853"/>
-        <w:gridCol w:w="1626"/>
+        <w:gridCol w:w="852"/>
+        <w:gridCol w:w="1627"/>
         <w:gridCol w:w="3112"/>
         <w:gridCol w:w="3981"/>
       </w:tblGrid>
@@ -5338,7 +5840,7 @@
         <w:trPr/>
         <w:tc>
           <w:tcPr>
-            <w:tcW w:w="853" w:type="dxa"/>
+            <w:tcW w:w="852" w:type="dxa"/>
             <w:tcBorders>
               <w:top w:val="single" w:sz="4" w:space="0" w:color="000000"/>
               <w:start w:val="single" w:sz="4" w:space="0" w:color="000000"/>
@@ -5369,7 +5871,7 @@
         </w:tc>
         <w:tc>
           <w:tcPr>
-            <w:tcW w:w="1626" w:type="dxa"/>
+            <w:tcW w:w="1627" w:type="dxa"/>
             <w:tcBorders>
               <w:top w:val="single" w:sz="4" w:space="0" w:color="000000"/>
               <w:start w:val="single" w:sz="4" w:space="0" w:color="000000"/>
@@ -5478,7 +5980,7 @@
         <w:trPr/>
         <w:tc>
           <w:tcPr>
-            <w:tcW w:w="853" w:type="dxa"/>
+            <w:tcW w:w="852" w:type="dxa"/>
             <w:tcBorders>
               <w:top w:val="single" w:sz="4" w:space="0" w:color="000000"/>
               <w:start w:val="single" w:sz="4" w:space="0" w:color="000000"/>
@@ -5509,7 +6011,7 @@
         </w:tc>
         <w:tc>
           <w:tcPr>
-            <w:tcW w:w="1626" w:type="dxa"/>
+            <w:tcW w:w="1627" w:type="dxa"/>
             <w:tcBorders>
               <w:top w:val="single" w:sz="4" w:space="0" w:color="000000"/>
               <w:start w:val="single" w:sz="4" w:space="0" w:color="000000"/>
@@ -5664,7 +6166,7 @@
         <w:trPr/>
         <w:tc>
           <w:tcPr>
-            <w:tcW w:w="853" w:type="dxa"/>
+            <w:tcW w:w="852" w:type="dxa"/>
             <w:tcBorders>
               <w:top w:val="single" w:sz="4" w:space="0" w:color="000000"/>
               <w:start w:val="single" w:sz="4" w:space="0" w:color="000000"/>
@@ -5695,7 +6197,7 @@
         </w:tc>
         <w:tc>
           <w:tcPr>
-            <w:tcW w:w="1626" w:type="dxa"/>
+            <w:tcW w:w="1627" w:type="dxa"/>
             <w:tcBorders>
               <w:top w:val="single" w:sz="4" w:space="0" w:color="000000"/>
               <w:start w:val="single" w:sz="4" w:space="0" w:color="000000"/>
@@ -5873,7 +6375,7 @@
         <w:trPr/>
         <w:tc>
           <w:tcPr>
-            <w:tcW w:w="853" w:type="dxa"/>
+            <w:tcW w:w="852" w:type="dxa"/>
             <w:tcBorders>
               <w:top w:val="single" w:sz="4" w:space="0" w:color="000000"/>
               <w:start w:val="single" w:sz="4" w:space="0" w:color="000000"/>
@@ -5904,7 +6406,7 @@
         </w:tc>
         <w:tc>
           <w:tcPr>
-            <w:tcW w:w="1626" w:type="dxa"/>
+            <w:tcW w:w="1627" w:type="dxa"/>
             <w:tcBorders>
               <w:top w:val="single" w:sz="4" w:space="0" w:color="000000"/>
               <w:start w:val="single" w:sz="4" w:space="0" w:color="000000"/>
@@ -6131,8 +6633,8 @@
         <w:tblLook w:noHBand="0" w:noVBand="1" w:firstColumn="1" w:lastRow="0" w:lastColumn="0" w:firstRow="1" w:val="04a0"/>
       </w:tblPr>
       <w:tblGrid>
-        <w:gridCol w:w="853"/>
-        <w:gridCol w:w="1626"/>
+        <w:gridCol w:w="852"/>
+        <w:gridCol w:w="1627"/>
         <w:gridCol w:w="3112"/>
         <w:gridCol w:w="3981"/>
       </w:tblGrid>
@@ -6140,7 +6642,7 @@
         <w:trPr/>
         <w:tc>
           <w:tcPr>
-            <w:tcW w:w="853" w:type="dxa"/>
+            <w:tcW w:w="852" w:type="dxa"/>
             <w:tcBorders>
               <w:top w:val="single" w:sz="4" w:space="0" w:color="000000"/>
               <w:start w:val="single" w:sz="4" w:space="0" w:color="000000"/>
@@ -6171,7 +6673,7 @@
         </w:tc>
         <w:tc>
           <w:tcPr>
-            <w:tcW w:w="1626" w:type="dxa"/>
+            <w:tcW w:w="1627" w:type="dxa"/>
             <w:tcBorders>
               <w:top w:val="single" w:sz="4" w:space="0" w:color="000000"/>
               <w:start w:val="single" w:sz="4" w:space="0" w:color="000000"/>
@@ -6280,7 +6782,7 @@
         <w:trPr/>
         <w:tc>
           <w:tcPr>
-            <w:tcW w:w="853" w:type="dxa"/>
+            <w:tcW w:w="852" w:type="dxa"/>
             <w:tcBorders>
               <w:top w:val="single" w:sz="4" w:space="0" w:color="000000"/>
               <w:start w:val="single" w:sz="4" w:space="0" w:color="000000"/>
@@ -6311,7 +6813,7 @@
         </w:tc>
         <w:tc>
           <w:tcPr>
-            <w:tcW w:w="1626" w:type="dxa"/>
+            <w:tcW w:w="1627" w:type="dxa"/>
             <w:tcBorders>
               <w:top w:val="single" w:sz="4" w:space="0" w:color="000000"/>
               <w:start w:val="single" w:sz="4" w:space="0" w:color="000000"/>
@@ -6489,7 +6991,7 @@
         <w:trPr/>
         <w:tc>
           <w:tcPr>
-            <w:tcW w:w="853" w:type="dxa"/>
+            <w:tcW w:w="852" w:type="dxa"/>
             <w:tcBorders>
               <w:top w:val="single" w:sz="4" w:space="0" w:color="000000"/>
               <w:start w:val="single" w:sz="4" w:space="0" w:color="000000"/>
@@ -6520,7 +7022,7 @@
         </w:tc>
         <w:tc>
           <w:tcPr>
-            <w:tcW w:w="1626" w:type="dxa"/>
+            <w:tcW w:w="1627" w:type="dxa"/>
             <w:tcBorders>
               <w:top w:val="single" w:sz="4" w:space="0" w:color="000000"/>
               <w:start w:val="single" w:sz="4" w:space="0" w:color="000000"/>
@@ -6698,7 +7200,7 @@
         <w:trPr/>
         <w:tc>
           <w:tcPr>
-            <w:tcW w:w="853" w:type="dxa"/>
+            <w:tcW w:w="852" w:type="dxa"/>
             <w:tcBorders>
               <w:top w:val="single" w:sz="4" w:space="0" w:color="000000"/>
               <w:start w:val="single" w:sz="4" w:space="0" w:color="000000"/>
@@ -6729,7 +7231,7 @@
         </w:tc>
         <w:tc>
           <w:tcPr>
-            <w:tcW w:w="1626" w:type="dxa"/>
+            <w:tcW w:w="1627" w:type="dxa"/>
             <w:tcBorders>
               <w:top w:val="single" w:sz="4" w:space="0" w:color="000000"/>
               <w:start w:val="single" w:sz="4" w:space="0" w:color="000000"/>
@@ -6940,8 +7442,8 @@
         <w:tblLook w:noHBand="0" w:noVBand="1" w:firstColumn="1" w:lastRow="0" w:lastColumn="0" w:firstRow="1" w:val="04a0"/>
       </w:tblPr>
       <w:tblGrid>
-        <w:gridCol w:w="853"/>
-        <w:gridCol w:w="1626"/>
+        <w:gridCol w:w="852"/>
+        <w:gridCol w:w="1627"/>
         <w:gridCol w:w="3112"/>
         <w:gridCol w:w="3981"/>
       </w:tblGrid>
@@ -6949,7 +7451,7 @@
         <w:trPr/>
         <w:tc>
           <w:tcPr>
-            <w:tcW w:w="853" w:type="dxa"/>
+            <w:tcW w:w="852" w:type="dxa"/>
             <w:tcBorders>
               <w:top w:val="single" w:sz="4" w:space="0" w:color="000000"/>
               <w:start w:val="single" w:sz="4" w:space="0" w:color="000000"/>
@@ -6981,7 +7483,7 @@
         </w:tc>
         <w:tc>
           <w:tcPr>
-            <w:tcW w:w="1626" w:type="dxa"/>
+            <w:tcW w:w="1627" w:type="dxa"/>
             <w:tcBorders>
               <w:top w:val="single" w:sz="4" w:space="0" w:color="000000"/>
               <w:start w:val="single" w:sz="4" w:space="0" w:color="000000"/>
@@ -7093,7 +7595,7 @@
         <w:trPr/>
         <w:tc>
           <w:tcPr>
-            <w:tcW w:w="853" w:type="dxa"/>
+            <w:tcW w:w="852" w:type="dxa"/>
             <w:tcBorders>
               <w:top w:val="single" w:sz="4" w:space="0" w:color="000000"/>
               <w:start w:val="single" w:sz="4" w:space="0" w:color="000000"/>
@@ -7125,7 +7627,7 @@
         </w:tc>
         <w:tc>
           <w:tcPr>
-            <w:tcW w:w="1626" w:type="dxa"/>
+            <w:tcW w:w="1627" w:type="dxa"/>
             <w:tcBorders>
               <w:top w:val="single" w:sz="4" w:space="0" w:color="000000"/>
               <w:start w:val="single" w:sz="4" w:space="0" w:color="000000"/>
@@ -7386,17 +7888,17 @@
         <w:tblLook w:noHBand="0" w:noVBand="1" w:firstColumn="1" w:lastRow="0" w:lastColumn="0" w:firstRow="1" w:val="04a0"/>
       </w:tblPr>
       <w:tblGrid>
-        <w:gridCol w:w="1980"/>
-        <w:gridCol w:w="1650"/>
+        <w:gridCol w:w="1979"/>
+        <w:gridCol w:w="1651"/>
         <w:gridCol w:w="1767"/>
-        <w:gridCol w:w="1755"/>
-        <w:gridCol w:w="2192"/>
+        <w:gridCol w:w="1754"/>
+        <w:gridCol w:w="2193"/>
       </w:tblGrid>
       <w:tr>
         <w:trPr/>
         <w:tc>
           <w:tcPr>
-            <w:tcW w:w="1980" w:type="dxa"/>
+            <w:tcW w:w="1979" w:type="dxa"/>
             <w:tcBorders/>
           </w:tcPr>
           <w:p>
@@ -7433,7 +7935,7 @@
         </w:tc>
         <w:tc>
           <w:tcPr>
-            <w:tcW w:w="1650" w:type="dxa"/>
+            <w:tcW w:w="1651" w:type="dxa"/>
             <w:tcBorders/>
           </w:tcPr>
           <w:p>
@@ -7507,7 +8009,7 @@
         </w:tc>
         <w:tc>
           <w:tcPr>
-            <w:tcW w:w="1755" w:type="dxa"/>
+            <w:tcW w:w="1754" w:type="dxa"/>
             <w:tcBorders/>
           </w:tcPr>
           <w:p>
@@ -7544,7 +8046,7 @@
         </w:tc>
         <w:tc>
           <w:tcPr>
-            <w:tcW w:w="2192" w:type="dxa"/>
+            <w:tcW w:w="2193" w:type="dxa"/>
             <w:tcBorders/>
           </w:tcPr>
           <w:p>
@@ -7584,7 +8086,7 @@
         <w:trPr/>
         <w:tc>
           <w:tcPr>
-            <w:tcW w:w="1980" w:type="dxa"/>
+            <w:tcW w:w="1979" w:type="dxa"/>
             <w:tcBorders/>
           </w:tcPr>
           <w:p>
@@ -7617,7 +8119,7 @@
         </w:tc>
         <w:tc>
           <w:tcPr>
-            <w:tcW w:w="1650" w:type="dxa"/>
+            <w:tcW w:w="1651" w:type="dxa"/>
             <w:tcBorders/>
           </w:tcPr>
           <w:p>
@@ -7683,7 +8185,7 @@
         </w:tc>
         <w:tc>
           <w:tcPr>
-            <w:tcW w:w="1755" w:type="dxa"/>
+            <w:tcW w:w="1754" w:type="dxa"/>
             <w:tcBorders/>
           </w:tcPr>
           <w:p>
@@ -7716,7 +8218,7 @@
         </w:tc>
         <w:tc>
           <w:tcPr>
-            <w:tcW w:w="2192" w:type="dxa"/>
+            <w:tcW w:w="2193" w:type="dxa"/>
             <w:tcBorders/>
           </w:tcPr>
           <w:p>
@@ -7752,7 +8254,7 @@
         <w:trPr/>
         <w:tc>
           <w:tcPr>
-            <w:tcW w:w="1980" w:type="dxa"/>
+            <w:tcW w:w="1979" w:type="dxa"/>
             <w:tcBorders/>
           </w:tcPr>
           <w:p>
@@ -7785,7 +8287,7 @@
         </w:tc>
         <w:tc>
           <w:tcPr>
-            <w:tcW w:w="1650" w:type="dxa"/>
+            <w:tcW w:w="1651" w:type="dxa"/>
             <w:tcBorders/>
           </w:tcPr>
           <w:p>
@@ -7851,7 +8353,7 @@
         </w:tc>
         <w:tc>
           <w:tcPr>
-            <w:tcW w:w="1755" w:type="dxa"/>
+            <w:tcW w:w="1754" w:type="dxa"/>
             <w:tcBorders/>
           </w:tcPr>
           <w:p>
@@ -7884,7 +8386,7 @@
         </w:tc>
         <w:tc>
           <w:tcPr>
-            <w:tcW w:w="2192" w:type="dxa"/>
+            <w:tcW w:w="2193" w:type="dxa"/>
             <w:tcBorders/>
           </w:tcPr>
           <w:p>
@@ -7920,7 +8422,7 @@
         <w:trPr/>
         <w:tc>
           <w:tcPr>
-            <w:tcW w:w="1980" w:type="dxa"/>
+            <w:tcW w:w="1979" w:type="dxa"/>
             <w:tcBorders/>
           </w:tcPr>
           <w:p>
@@ -7953,7 +8455,7 @@
         </w:tc>
         <w:tc>
           <w:tcPr>
-            <w:tcW w:w="1650" w:type="dxa"/>
+            <w:tcW w:w="1651" w:type="dxa"/>
             <w:tcBorders/>
           </w:tcPr>
           <w:p>
@@ -8019,7 +8521,7 @@
         </w:tc>
         <w:tc>
           <w:tcPr>
-            <w:tcW w:w="1755" w:type="dxa"/>
+            <w:tcW w:w="1754" w:type="dxa"/>
             <w:tcBorders/>
           </w:tcPr>
           <w:p>
@@ -8052,7 +8554,7 @@
         </w:tc>
         <w:tc>
           <w:tcPr>
-            <w:tcW w:w="2192" w:type="dxa"/>
+            <w:tcW w:w="2193" w:type="dxa"/>
             <w:tcBorders/>
           </w:tcPr>
           <w:p>
@@ -8088,7 +8590,7 @@
         <w:trPr/>
         <w:tc>
           <w:tcPr>
-            <w:tcW w:w="1980" w:type="dxa"/>
+            <w:tcW w:w="1979" w:type="dxa"/>
             <w:tcBorders/>
           </w:tcPr>
           <w:p>
@@ -8121,7 +8623,7 @@
         </w:tc>
         <w:tc>
           <w:tcPr>
-            <w:tcW w:w="1650" w:type="dxa"/>
+            <w:tcW w:w="1651" w:type="dxa"/>
             <w:tcBorders/>
           </w:tcPr>
           <w:p>
@@ -8187,7 +8689,7 @@
         </w:tc>
         <w:tc>
           <w:tcPr>
-            <w:tcW w:w="1755" w:type="dxa"/>
+            <w:tcW w:w="1754" w:type="dxa"/>
             <w:tcBorders/>
           </w:tcPr>
           <w:p>
@@ -8220,7 +8722,7 @@
         </w:tc>
         <w:tc>
           <w:tcPr>
-            <w:tcW w:w="2192" w:type="dxa"/>
+            <w:tcW w:w="2193" w:type="dxa"/>
             <w:tcBorders/>
           </w:tcPr>
           <w:p>
@@ -8256,7 +8758,7 @@
         <w:trPr/>
         <w:tc>
           <w:tcPr>
-            <w:tcW w:w="1980" w:type="dxa"/>
+            <w:tcW w:w="1979" w:type="dxa"/>
             <w:tcBorders/>
           </w:tcPr>
           <w:p>
@@ -8289,7 +8791,7 @@
         </w:tc>
         <w:tc>
           <w:tcPr>
-            <w:tcW w:w="1650" w:type="dxa"/>
+            <w:tcW w:w="1651" w:type="dxa"/>
             <w:tcBorders/>
           </w:tcPr>
           <w:p>
@@ -8355,7 +8857,7 @@
         </w:tc>
         <w:tc>
           <w:tcPr>
-            <w:tcW w:w="1755" w:type="dxa"/>
+            <w:tcW w:w="1754" w:type="dxa"/>
             <w:tcBorders/>
           </w:tcPr>
           <w:p>
@@ -8388,7 +8890,7 @@
         </w:tc>
         <w:tc>
           <w:tcPr>
-            <w:tcW w:w="2192" w:type="dxa"/>
+            <w:tcW w:w="2193" w:type="dxa"/>
             <w:tcBorders/>
           </w:tcPr>
           <w:p>
@@ -8424,7 +8926,7 @@
         <w:trPr/>
         <w:tc>
           <w:tcPr>
-            <w:tcW w:w="1980" w:type="dxa"/>
+            <w:tcW w:w="1979" w:type="dxa"/>
             <w:tcBorders/>
           </w:tcPr>
           <w:p>
@@ -8457,7 +8959,7 @@
         </w:tc>
         <w:tc>
           <w:tcPr>
-            <w:tcW w:w="1650" w:type="dxa"/>
+            <w:tcW w:w="1651" w:type="dxa"/>
             <w:tcBorders/>
           </w:tcPr>
           <w:p>
@@ -8523,7 +9025,7 @@
         </w:tc>
         <w:tc>
           <w:tcPr>
-            <w:tcW w:w="1755" w:type="dxa"/>
+            <w:tcW w:w="1754" w:type="dxa"/>
             <w:tcBorders/>
           </w:tcPr>
           <w:p>
@@ -8556,7 +9058,7 @@
         </w:tc>
         <w:tc>
           <w:tcPr>
-            <w:tcW w:w="2192" w:type="dxa"/>
+            <w:tcW w:w="2193" w:type="dxa"/>
             <w:tcBorders/>
           </w:tcPr>
           <w:p>
@@ -8592,7 +9094,7 @@
         <w:trPr/>
         <w:tc>
           <w:tcPr>
-            <w:tcW w:w="1980" w:type="dxa"/>
+            <w:tcW w:w="1979" w:type="dxa"/>
             <w:tcBorders/>
           </w:tcPr>
           <w:p>
@@ -8625,7 +9127,7 @@
         </w:tc>
         <w:tc>
           <w:tcPr>
-            <w:tcW w:w="1650" w:type="dxa"/>
+            <w:tcW w:w="1651" w:type="dxa"/>
             <w:tcBorders/>
           </w:tcPr>
           <w:p>
@@ -8691,7 +9193,7 @@
         </w:tc>
         <w:tc>
           <w:tcPr>
-            <w:tcW w:w="1755" w:type="dxa"/>
+            <w:tcW w:w="1754" w:type="dxa"/>
             <w:tcBorders/>
           </w:tcPr>
           <w:p>
@@ -8724,7 +9226,7 @@
         </w:tc>
         <w:tc>
           <w:tcPr>
-            <w:tcW w:w="2192" w:type="dxa"/>
+            <w:tcW w:w="2193" w:type="dxa"/>
             <w:tcBorders/>
           </w:tcPr>
           <w:p>
@@ -8777,6 +9279,29 @@
           <w:szCs w:val="28"/>
           <w:lang w:val="ru-RU"/>
         </w:rPr>
+      </w:r>
+    </w:p>
+    <w:p>
+      <w:pPr>
+        <w:pStyle w:val="Normal"/>
+        <w:spacing w:lineRule="auto" w:line="360" w:before="0" w:after="0"/>
+        <w:ind w:firstLine="709"/>
+        <w:jc w:val="both"/>
+        <w:rPr>
+          <w:rFonts w:ascii="Times New Roman" w:hAnsi="Times New Roman" w:eastAsia="Times New Roman" w:cs="Times New Roman"/>
+          <w:sz w:val="28"/>
+          <w:szCs w:val="28"/>
+          <w:lang w:val="ru-RU"/>
+        </w:rPr>
+      </w:pPr>
+      <w:r>
+        <w:rPr>
+          <w:rFonts w:eastAsia="Times New Roman" w:cs="Times New Roman" w:ascii="Times New Roman" w:hAnsi="Times New Roman"/>
+          <w:sz w:val="28"/>
+          <w:szCs w:val="28"/>
+          <w:lang w:val="ru-RU"/>
+        </w:rPr>
+        <w:t>Проведенное сравнение разрабатываемого программного обеспечения с существующими аналогами демонстрирует его конкурентные преимущества. Являясь веб-приложением, разрабатываемый продукт предоставляет бесплатную базовую версию. Ключевым отличием является наличие автоматической генерации. Кроме того, разрабатываемое ПО обеспечивает экспорт без водяных знаков, облачное сохранение и полноценную работу со слоями.</w:t>
       </w:r>
     </w:p>
     <w:p>
@@ -9100,7 +9625,7 @@
           <wp:inline distT="0" distB="0" distL="0" distR="0">
             <wp:extent cx="4702175" cy="5124450"/>
             <wp:effectExtent l="0" t="0" r="0" b="0"/>
-            <wp:docPr id="1" name="Рисунок 1" descr="D:\Me\Study\7semester\orpo\dLNVIXjF5BwVfpXufHVYB_7_xq8ilUXzYm-m95iDnaIIpKLf2oPRQK6ffHPQ2lRF0nJyapMRh9kymfatwZV76UEu54f1bzblp_c-SxwPCzbiHq4hwkpLLJry7b7Kf5PjUoUYQgqLLg9Qiw7QkxN6Vj0AzcW_gEm6s-6pw4Kz9FCvQ6pNGwM2IjHiqGoVSSBdVAbxFDO7dFA0ntm99ETS.png"/>
+            <wp:docPr id="5" name="Рисунок 1" descr="D:\Me\Study\7semester\orpo\dLNVIXjF5BwVfpXufHVYB_7_xq8ilUXzYm-m95iDnaIIpKLf2oPRQK6ffHPQ2lRF0nJyapMRh9kymfatwZV76UEu54f1bzblp_c-SxwPCzbiHq4hwkpLLJry7b7Kf5PjUoUYQgqLLg9Qiw7QkxN6Vj0AzcW_gEm6s-6pw4Kz9FCvQ6pNGwM2IjHiqGoVSSBdVAbxFDO7dFA0ntm99ETS.png"/>
             <wp:cNvGraphicFramePr>
               <a:graphicFrameLocks xmlns:a="http://schemas.openxmlformats.org/drawingml/2006/main" noChangeAspect="1"/>
             </wp:cNvGraphicFramePr>
@@ -9108,13 +9633,13 @@
               <a:graphicData uri="http://schemas.openxmlformats.org/drawingml/2006/picture">
                 <pic:pic xmlns:pic="http://schemas.openxmlformats.org/drawingml/2006/picture">
                   <pic:nvPicPr>
-                    <pic:cNvPr id="1" name="Рисунок 1" descr="D:\Me\Study\7semester\orpo\dLNVIXjF5BwVfpXufHVYB_7_xq8ilUXzYm-m95iDnaIIpKLf2oPRQK6ffHPQ2lRF0nJyapMRh9kymfatwZV76UEu54f1bzblp_c-SxwPCzbiHq4hwkpLLJry7b7Kf5PjUoUYQgqLLg9Qiw7QkxN6Vj0AzcW_gEm6s-6pw4Kz9FCvQ6pNGwM2IjHiqGoVSSBdVAbxFDO7dFA0ntm99ETS.png"/>
+                    <pic:cNvPr id="5" name="Рисунок 1" descr="D:\Me\Study\7semester\orpo\dLNVIXjF5BwVfpXufHVYB_7_xq8ilUXzYm-m95iDnaIIpKLf2oPRQK6ffHPQ2lRF0nJyapMRh9kymfatwZV76UEu54f1bzblp_c-SxwPCzbiHq4hwkpLLJry7b7Kf5PjUoUYQgqLLg9Qiw7QkxN6Vj0AzcW_gEm6s-6pw4Kz9FCvQ6pNGwM2IjHiqGoVSSBdVAbxFDO7dFA0ntm99ETS.png"/>
                     <pic:cNvPicPr>
                       <a:picLocks noChangeAspect="1" noChangeArrowheads="1"/>
                     </pic:cNvPicPr>
                   </pic:nvPicPr>
                   <pic:blipFill>
-                    <a:blip r:embed="rId2"/>
+                    <a:blip r:embed="rId6"/>
                     <a:stretch>
                       <a:fillRect/>
                     </a:stretch>
@@ -9137,9 +9662,9 @@
       </w:r>
     </w:p>
     <w:sectPr>
-      <w:footerReference w:type="even" r:id="rId3"/>
-      <w:footerReference w:type="default" r:id="rId4"/>
-      <w:footerReference w:type="first" r:id="rId5"/>
+      <w:footerReference w:type="even" r:id="rId7"/>
+      <w:footerReference w:type="default" r:id="rId8"/>
+      <w:footerReference w:type="first" r:id="rId9"/>
       <w:type w:val="nextPage"/>
       <w:pgSz w:w="11906" w:h="16838"/>
       <w:pgMar w:left="1701" w:right="851" w:gutter="0" w:header="0" w:top="1134" w:footer="708" w:bottom="1134"/>
@@ -9198,7 +9723,7 @@
         </w:r>
         <w:r>
           <w:rPr/>
-          <w:t>15</w:t>
+          <w:t>18</w:t>
         </w:r>
         <w:r>
           <w:rPr/>

</xml_diff>